<commit_message>
Split consulting engagements, add LinkedIn projects
</commit_message>
<xml_diff>
--- a/public/Haneet_Singh_Resume.docx
+++ b/public/Haneet_Singh_Resume.docx
@@ -87,23 +87,23 @@
           <w:b/>
           <w:bCs/>
         </w:rPr>
-        <w:t xml:space="preserve">Software Engineering Consultant — Self-employed</w:t>
-      </w:r>
-      <w:r>
-        <w:t xml:space="preserve">, Remote  |  Mar 2025 — Present</w:t>
-      </w:r>
-    </w:p>
-    <w:p>
-      <w:pPr>
-        <w:pStyle w:val="ListParagraph"/>
-        <w:numPr>
-          <w:ilvl w:val="0"/>
-          <w:numId w:val="2"/>
-        </w:numPr>
-        <w:spacing w:after="60"/>
-      </w:pPr>
-      <w:r>
-        <w:t xml:space="preserve">Leading a platform engagement with Liberty Mutual (Oct 2025–present) as Senior Software Engineer, providing technical leadership on an enterprise platform supporting thousands of users in a regulated environment.</w:t>
+        <w:t xml:space="preserve">Software Engineering Consultant (Senior Software Engineer, Liberty Mutual) — Self-employed</w:t>
+      </w:r>
+      <w:r>
+        <w:t xml:space="preserve">, Remote  |  Oct 2025 — Present</w:t>
+      </w:r>
+    </w:p>
+    <w:p>
+      <w:pPr>
+        <w:pStyle w:val="ListParagraph"/>
+        <w:numPr>
+          <w:ilvl w:val="0"/>
+          <w:numId w:val="2"/>
+        </w:numPr>
+        <w:spacing w:after="60"/>
+      </w:pPr>
+      <w:r>
+        <w:t xml:space="preserve">Providing technical leadership on an enterprise platform supporting thousands of users in a regulated environment.</w:t>
       </w:r>
     </w:p>
     <w:p>
@@ -160,15 +160,30 @@
     </w:p>
     <w:p>
       <w:pPr>
-        <w:pStyle w:val="ListParagraph"/>
-        <w:numPr>
-          <w:ilvl w:val="0"/>
-          <w:numId w:val="2"/>
-        </w:numPr>
-        <w:spacing w:after="60"/>
-      </w:pPr>
-      <w:r>
-        <w:t xml:space="preserve">Built and maintained web applications for the Everstream Analytics supply chain risk platform (Mar–Aug 2025) using TypeScript, Next.js, Tailwind CSS, and Django, with a strong focus on accessibility and pixel-accurate UI.</w:t>
+        <w:spacing w:after="40" w:before="200"/>
+      </w:pPr>
+      <w:r>
+        <w:rPr>
+          <w:b/>
+          <w:bCs/>
+        </w:rPr>
+        <w:t xml:space="preserve">Software Engineering Consultant (Software Engineer, Everstream Analytics) — Self-employed</w:t>
+      </w:r>
+      <w:r>
+        <w:t xml:space="preserve">, Remote  |  Mar 2025 — Aug 2025</w:t>
+      </w:r>
+    </w:p>
+    <w:p>
+      <w:pPr>
+        <w:pStyle w:val="ListParagraph"/>
+        <w:numPr>
+          <w:ilvl w:val="0"/>
+          <w:numId w:val="2"/>
+        </w:numPr>
+        <w:spacing w:after="60"/>
+      </w:pPr>
+      <w:r>
+        <w:t xml:space="preserve">Built and maintained web applications for the Everstream Analytics supply chain risk platform using TypeScript, Next.js, Tailwind CSS, and Django, with a strong focus on accessibility and pixel-accurate UI.</w:t>
       </w:r>
     </w:p>
     <w:p>

</xml_diff>